<commit_message>
Auto-generate jadwal sholat bulan depan
</commit_message>
<xml_diff>
--- a/output/jadwal-sholat-agustus-2026.docx
+++ b/output/jadwal-sholat-agustus-2026.docx
@@ -57,7 +57,7 @@
     <w:p/>
     <w:tbl>
       <w:tblPr>
-        <w:tblW w:type="dxa" w:w="10742"/>
+        <w:tblW w:type="dxa" w:w="10175"/>
         <w:jc w:val="center"/>
         <w:tblLook w:firstColumn="1" w:firstRow="1" w:lastColumn="0" w:lastRow="0" w:noHBand="0" w:noVBand="1" w:val="04A0"/>
         <w:tblBorders>
@@ -93,7 +93,7 @@
       <w:tr>
         <w:tc>
           <w:tcPr>
-            <w:tcW w:type="dxa" w:w="595"/>
+            <w:tcW w:type="dxa" w:w="283"/>
             <w:shd w:val="clear" w:color="auto" w:fill="5F497A"/>
           </w:tcPr>
           <w:p>
@@ -115,7 +115,7 @@
         </w:tc>
         <w:tc>
           <w:tcPr>
-            <w:tcW w:type="dxa" w:w="595"/>
+            <w:tcW w:type="dxa" w:w="283"/>
             <w:shd w:val="clear" w:color="auto" w:fill="5F497A"/>
           </w:tcPr>
           <w:p>
@@ -203,6 +203,94 @@
         </w:tc>
         <w:tc>
           <w:tcPr>
+            <w:tcW w:type="dxa" w:w="1219"/>
+            <w:shd w:val="clear" w:color="auto" w:fill="5F497A"/>
+          </w:tcPr>
+          <w:p>
+            <w:pPr>
+              <w:spacing w:before="0" w:after="0"/>
+              <w:jc w:val="center"/>
+            </w:pPr>
+            <w:r/>
+            <w:r>
+              <w:rPr>
+                <w:rFonts w:ascii="Archivo Black" w:hAnsi="Archivo Black"/>
+                <w:b/>
+                <w:color w:val="FFFFFF"/>
+                <w:sz w:val="20"/>
+              </w:rPr>
+              <w:t>SYURUQ</w:t>
+            </w:r>
+          </w:p>
+        </w:tc>
+        <w:tc>
+          <w:tcPr>
+            <w:tcW w:type="dxa" w:w="879"/>
+            <w:shd w:val="clear" w:color="auto" w:fill="5F497A"/>
+          </w:tcPr>
+          <w:p>
+            <w:pPr>
+              <w:spacing w:before="0" w:after="0"/>
+              <w:jc w:val="center"/>
+            </w:pPr>
+            <w:r/>
+            <w:r>
+              <w:rPr>
+                <w:rFonts w:ascii="Archivo Black" w:hAnsi="Archivo Black"/>
+                <w:b/>
+                <w:color w:val="FFFFFF"/>
+                <w:sz w:val="20"/>
+              </w:rPr>
+              <w:t>DUHA</w:t>
+            </w:r>
+          </w:p>
+        </w:tc>
+        <w:tc>
+          <w:tcPr>
+            <w:tcW w:type="dxa" w:w="1049"/>
+            <w:shd w:val="clear" w:color="auto" w:fill="5F497A"/>
+          </w:tcPr>
+          <w:p>
+            <w:pPr>
+              <w:spacing w:before="0" w:after="0"/>
+              <w:jc w:val="center"/>
+            </w:pPr>
+            <w:r/>
+            <w:r>
+              <w:rPr>
+                <w:rFonts w:ascii="Archivo Black" w:hAnsi="Archivo Black"/>
+                <w:b/>
+                <w:color w:val="FFFFFF"/>
+                <w:sz w:val="20"/>
+              </w:rPr>
+              <w:t>ZUHUR</w:t>
+            </w:r>
+          </w:p>
+        </w:tc>
+        <w:tc>
+          <w:tcPr>
+            <w:tcW w:type="dxa" w:w="879"/>
+            <w:shd w:val="clear" w:color="auto" w:fill="5F497A"/>
+          </w:tcPr>
+          <w:p>
+            <w:pPr>
+              <w:spacing w:before="0" w:after="0"/>
+              <w:jc w:val="center"/>
+            </w:pPr>
+            <w:r/>
+            <w:r>
+              <w:rPr>
+                <w:rFonts w:ascii="Archivo Black" w:hAnsi="Archivo Black"/>
+                <w:b/>
+                <w:color w:val="FFFFFF"/>
+                <w:sz w:val="20"/>
+              </w:rPr>
+              <w:t>ASAR</w:t>
+            </w:r>
+          </w:p>
+        </w:tc>
+        <w:tc>
+          <w:tcPr>
             <w:tcW w:type="dxa" w:w="1162"/>
             <w:shd w:val="clear" w:color="auto" w:fill="5F497A"/>
           </w:tcPr>
@@ -219,7 +307,7 @@
                 <w:color w:val="FFFFFF"/>
                 <w:sz w:val="20"/>
               </w:rPr>
-              <w:t>SYURUQ</w:t>
+              <w:t>MAGRIB</w:t>
             </w:r>
           </w:p>
         </w:tc>
@@ -241,94 +329,6 @@
                 <w:color w:val="FFFFFF"/>
                 <w:sz w:val="20"/>
               </w:rPr>
-              <w:t>DUHA</w:t>
-            </w:r>
-          </w:p>
-        </w:tc>
-        <w:tc>
-          <w:tcPr>
-            <w:tcW w:type="dxa" w:w="1049"/>
-            <w:shd w:val="clear" w:color="auto" w:fill="5F497A"/>
-          </w:tcPr>
-          <w:p>
-            <w:pPr>
-              <w:spacing w:before="0" w:after="0"/>
-              <w:jc w:val="center"/>
-            </w:pPr>
-            <w:r/>
-            <w:r>
-              <w:rPr>
-                <w:rFonts w:ascii="Archivo Black" w:hAnsi="Archivo Black"/>
-                <w:b/>
-                <w:color w:val="FFFFFF"/>
-                <w:sz w:val="20"/>
-              </w:rPr>
-              <w:t>ZUHUR</w:t>
-            </w:r>
-          </w:p>
-        </w:tc>
-        <w:tc>
-          <w:tcPr>
-            <w:tcW w:type="dxa" w:w="879"/>
-            <w:shd w:val="clear" w:color="auto" w:fill="5F497A"/>
-          </w:tcPr>
-          <w:p>
-            <w:pPr>
-              <w:spacing w:before="0" w:after="0"/>
-              <w:jc w:val="center"/>
-            </w:pPr>
-            <w:r/>
-            <w:r>
-              <w:rPr>
-                <w:rFonts w:ascii="Archivo Black" w:hAnsi="Archivo Black"/>
-                <w:b/>
-                <w:color w:val="FFFFFF"/>
-                <w:sz w:val="20"/>
-              </w:rPr>
-              <w:t>ASAR</w:t>
-            </w:r>
-          </w:p>
-        </w:tc>
-        <w:tc>
-          <w:tcPr>
-            <w:tcW w:type="dxa" w:w="1162"/>
-            <w:shd w:val="clear" w:color="auto" w:fill="5F497A"/>
-          </w:tcPr>
-          <w:p>
-            <w:pPr>
-              <w:spacing w:before="0" w:after="0"/>
-              <w:jc w:val="center"/>
-            </w:pPr>
-            <w:r/>
-            <w:r>
-              <w:rPr>
-                <w:rFonts w:ascii="Archivo Black" w:hAnsi="Archivo Black"/>
-                <w:b/>
-                <w:color w:val="FFFFFF"/>
-                <w:sz w:val="20"/>
-              </w:rPr>
-              <w:t>MAGRIB</w:t>
-            </w:r>
-          </w:p>
-        </w:tc>
-        <w:tc>
-          <w:tcPr>
-            <w:tcW w:type="dxa" w:w="879"/>
-            <w:shd w:val="clear" w:color="auto" w:fill="5F497A"/>
-          </w:tcPr>
-          <w:p>
-            <w:pPr>
-              <w:spacing w:before="0" w:after="0"/>
-              <w:jc w:val="center"/>
-            </w:pPr>
-            <w:r/>
-            <w:r>
-              <w:rPr>
-                <w:rFonts w:ascii="Archivo Black" w:hAnsi="Archivo Black"/>
-                <w:b/>
-                <w:color w:val="FFFFFF"/>
-                <w:sz w:val="20"/>
-              </w:rPr>
               <w:t>ISYA</w:t>
             </w:r>
           </w:p>
@@ -337,7 +337,7 @@
       <w:tr>
         <w:tc>
           <w:tcPr>
-            <w:tcW w:type="dxa" w:w="595"/>
+            <w:tcW w:type="dxa" w:w="283"/>
             <w:shd w:val="clear" w:color="auto" w:fill="B6DDE8"/>
           </w:tcPr>
           <w:p>
@@ -358,7 +358,7 @@
         </w:tc>
         <w:tc>
           <w:tcPr>
-            <w:tcW w:type="dxa" w:w="595"/>
+            <w:tcW w:type="dxa" w:w="283"/>
             <w:shd w:val="clear" w:color="auto" w:fill="B6DDE8"/>
           </w:tcPr>
           <w:p>
@@ -442,7 +442,7 @@
         </w:tc>
         <w:tc>
           <w:tcPr>
-            <w:tcW w:type="dxa" w:w="1162"/>
+            <w:tcW w:type="dxa" w:w="1219"/>
             <w:shd w:val="clear" w:color="auto" w:fill="B6DDE8"/>
           </w:tcPr>
           <w:p>
@@ -570,7 +570,7 @@
       <w:tr>
         <w:tc>
           <w:tcPr>
-            <w:tcW w:type="dxa" w:w="595"/>
+            <w:tcW w:type="dxa" w:w="283"/>
             <w:shd w:val="clear" w:color="auto" w:fill="B6DDE8"/>
           </w:tcPr>
           <w:p>
@@ -591,7 +591,7 @@
         </w:tc>
         <w:tc>
           <w:tcPr>
-            <w:tcW w:type="dxa" w:w="595"/>
+            <w:tcW w:type="dxa" w:w="283"/>
             <w:shd w:val="clear" w:color="auto" w:fill="B6DDE8"/>
           </w:tcPr>
           <w:p>
@@ -676,7 +676,7 @@
         </w:tc>
         <w:tc>
           <w:tcPr>
-            <w:tcW w:type="dxa" w:w="1162"/>
+            <w:tcW w:type="dxa" w:w="1219"/>
             <w:shd w:val="clear" w:color="auto" w:fill="B6DDE8"/>
           </w:tcPr>
           <w:p>
@@ -804,7 +804,7 @@
       <w:tr>
         <w:tc>
           <w:tcPr>
-            <w:tcW w:type="dxa" w:w="595"/>
+            <w:tcW w:type="dxa" w:w="283"/>
             <w:shd w:val="clear" w:color="auto" w:fill="B6DDE8"/>
           </w:tcPr>
           <w:p>
@@ -825,7 +825,7 @@
         </w:tc>
         <w:tc>
           <w:tcPr>
-            <w:tcW w:type="dxa" w:w="595"/>
+            <w:tcW w:type="dxa" w:w="283"/>
             <w:shd w:val="clear" w:color="auto" w:fill="B6DDE8"/>
           </w:tcPr>
           <w:p>
@@ -911,7 +911,7 @@
         </w:tc>
         <w:tc>
           <w:tcPr>
-            <w:tcW w:type="dxa" w:w="1162"/>
+            <w:tcW w:type="dxa" w:w="1219"/>
             <w:shd w:val="clear" w:color="auto" w:fill="B6DDE8"/>
           </w:tcPr>
           <w:p>
@@ -1041,7 +1041,7 @@
       <w:tr>
         <w:tc>
           <w:tcPr>
-            <w:tcW w:type="dxa" w:w="595"/>
+            <w:tcW w:type="dxa" w:w="283"/>
             <w:shd w:val="clear" w:color="auto" w:fill="B6DDE8"/>
           </w:tcPr>
           <w:p>
@@ -1062,7 +1062,7 @@
         </w:tc>
         <w:tc>
           <w:tcPr>
-            <w:tcW w:type="dxa" w:w="595"/>
+            <w:tcW w:type="dxa" w:w="283"/>
             <w:shd w:val="clear" w:color="auto" w:fill="B6DDE8"/>
           </w:tcPr>
           <w:p>
@@ -1146,7 +1146,7 @@
         </w:tc>
         <w:tc>
           <w:tcPr>
-            <w:tcW w:type="dxa" w:w="1162"/>
+            <w:tcW w:type="dxa" w:w="1219"/>
             <w:shd w:val="clear" w:color="auto" w:fill="B6DDE8"/>
           </w:tcPr>
           <w:p>
@@ -1274,7 +1274,7 @@
       <w:tr>
         <w:tc>
           <w:tcPr>
-            <w:tcW w:type="dxa" w:w="595"/>
+            <w:tcW w:type="dxa" w:w="283"/>
             <w:shd w:val="clear" w:color="auto" w:fill="B6DDE8"/>
           </w:tcPr>
           <w:p>
@@ -1295,7 +1295,7 @@
         </w:tc>
         <w:tc>
           <w:tcPr>
-            <w:tcW w:type="dxa" w:w="595"/>
+            <w:tcW w:type="dxa" w:w="283"/>
             <w:shd w:val="clear" w:color="auto" w:fill="B6DDE8"/>
           </w:tcPr>
           <w:p>
@@ -1379,7 +1379,7 @@
         </w:tc>
         <w:tc>
           <w:tcPr>
-            <w:tcW w:type="dxa" w:w="1162"/>
+            <w:tcW w:type="dxa" w:w="1219"/>
             <w:shd w:val="clear" w:color="auto" w:fill="B6DDE8"/>
           </w:tcPr>
           <w:p>
@@ -1507,7 +1507,7 @@
       <w:tr>
         <w:tc>
           <w:tcPr>
-            <w:tcW w:type="dxa" w:w="595"/>
+            <w:tcW w:type="dxa" w:w="283"/>
             <w:shd w:val="clear" w:color="auto" w:fill="B6DDE8"/>
           </w:tcPr>
           <w:p>
@@ -1528,7 +1528,7 @@
         </w:tc>
         <w:tc>
           <w:tcPr>
-            <w:tcW w:type="dxa" w:w="595"/>
+            <w:tcW w:type="dxa" w:w="283"/>
             <w:shd w:val="clear" w:color="auto" w:fill="B6DDE8"/>
           </w:tcPr>
           <w:p>
@@ -1614,7 +1614,7 @@
         </w:tc>
         <w:tc>
           <w:tcPr>
-            <w:tcW w:type="dxa" w:w="1162"/>
+            <w:tcW w:type="dxa" w:w="1219"/>
             <w:shd w:val="clear" w:color="auto" w:fill="B6DDE8"/>
           </w:tcPr>
           <w:p>
@@ -1744,7 +1744,7 @@
       <w:tr>
         <w:tc>
           <w:tcPr>
-            <w:tcW w:type="dxa" w:w="595"/>
+            <w:tcW w:type="dxa" w:w="283"/>
             <w:shd w:val="clear" w:color="auto" w:fill="B6DDE8"/>
           </w:tcPr>
           <w:p>
@@ -1765,7 +1765,7 @@
         </w:tc>
         <w:tc>
           <w:tcPr>
-            <w:tcW w:type="dxa" w:w="595"/>
+            <w:tcW w:type="dxa" w:w="283"/>
             <w:shd w:val="clear" w:color="auto" w:fill="B6DDE8"/>
           </w:tcPr>
           <w:p>
@@ -1851,7 +1851,7 @@
         </w:tc>
         <w:tc>
           <w:tcPr>
-            <w:tcW w:type="dxa" w:w="1162"/>
+            <w:tcW w:type="dxa" w:w="1219"/>
             <w:shd w:val="clear" w:color="auto" w:fill="B6DDE8"/>
           </w:tcPr>
           <w:p>
@@ -1981,7 +1981,7 @@
       <w:tr>
         <w:tc>
           <w:tcPr>
-            <w:tcW w:type="dxa" w:w="595"/>
+            <w:tcW w:type="dxa" w:w="283"/>
             <w:shd w:val="clear" w:color="auto" w:fill="B6DDE8"/>
           </w:tcPr>
           <w:p>
@@ -2002,7 +2002,7 @@
         </w:tc>
         <w:tc>
           <w:tcPr>
-            <w:tcW w:type="dxa" w:w="595"/>
+            <w:tcW w:type="dxa" w:w="283"/>
             <w:shd w:val="clear" w:color="auto" w:fill="B6DDE8"/>
           </w:tcPr>
           <w:p>
@@ -2086,7 +2086,7 @@
         </w:tc>
         <w:tc>
           <w:tcPr>
-            <w:tcW w:type="dxa" w:w="1162"/>
+            <w:tcW w:type="dxa" w:w="1219"/>
             <w:shd w:val="clear" w:color="auto" w:fill="B6DDE8"/>
           </w:tcPr>
           <w:p>
@@ -2214,7 +2214,7 @@
       <w:tr>
         <w:tc>
           <w:tcPr>
-            <w:tcW w:type="dxa" w:w="595"/>
+            <w:tcW w:type="dxa" w:w="283"/>
             <w:shd w:val="clear" w:color="auto" w:fill="B6DDE8"/>
           </w:tcPr>
           <w:p>
@@ -2235,7 +2235,7 @@
         </w:tc>
         <w:tc>
           <w:tcPr>
-            <w:tcW w:type="dxa" w:w="595"/>
+            <w:tcW w:type="dxa" w:w="283"/>
             <w:shd w:val="clear" w:color="auto" w:fill="B6DDE8"/>
           </w:tcPr>
           <w:p>
@@ -2320,7 +2320,7 @@
         </w:tc>
         <w:tc>
           <w:tcPr>
-            <w:tcW w:type="dxa" w:w="1162"/>
+            <w:tcW w:type="dxa" w:w="1219"/>
             <w:shd w:val="clear" w:color="auto" w:fill="B6DDE8"/>
           </w:tcPr>
           <w:p>
@@ -2448,7 +2448,7 @@
       <w:tr>
         <w:tc>
           <w:tcPr>
-            <w:tcW w:type="dxa" w:w="595"/>
+            <w:tcW w:type="dxa" w:w="283"/>
             <w:shd w:val="clear" w:color="auto" w:fill="B6DDE8"/>
           </w:tcPr>
           <w:p>
@@ -2469,7 +2469,7 @@
         </w:tc>
         <w:tc>
           <w:tcPr>
-            <w:tcW w:type="dxa" w:w="595"/>
+            <w:tcW w:type="dxa" w:w="283"/>
             <w:shd w:val="clear" w:color="auto" w:fill="B6DDE8"/>
           </w:tcPr>
           <w:p>
@@ -2555,7 +2555,7 @@
         </w:tc>
         <w:tc>
           <w:tcPr>
-            <w:tcW w:type="dxa" w:w="1162"/>
+            <w:tcW w:type="dxa" w:w="1219"/>
             <w:shd w:val="clear" w:color="auto" w:fill="B6DDE8"/>
           </w:tcPr>
           <w:p>
@@ -2685,7 +2685,7 @@
       <w:tr>
         <w:tc>
           <w:tcPr>
-            <w:tcW w:type="dxa" w:w="595"/>
+            <w:tcW w:type="dxa" w:w="283"/>
             <w:shd w:val="clear" w:color="auto" w:fill="B6DDE8"/>
           </w:tcPr>
           <w:p>
@@ -2706,7 +2706,7 @@
         </w:tc>
         <w:tc>
           <w:tcPr>
-            <w:tcW w:type="dxa" w:w="595"/>
+            <w:tcW w:type="dxa" w:w="283"/>
             <w:shd w:val="clear" w:color="auto" w:fill="B6DDE8"/>
           </w:tcPr>
           <w:p>
@@ -2790,7 +2790,7 @@
         </w:tc>
         <w:tc>
           <w:tcPr>
-            <w:tcW w:type="dxa" w:w="1162"/>
+            <w:tcW w:type="dxa" w:w="1219"/>
             <w:shd w:val="clear" w:color="auto" w:fill="B6DDE8"/>
           </w:tcPr>
           <w:p>
@@ -2918,7 +2918,7 @@
       <w:tr>
         <w:tc>
           <w:tcPr>
-            <w:tcW w:type="dxa" w:w="595"/>
+            <w:tcW w:type="dxa" w:w="283"/>
             <w:shd w:val="clear" w:color="auto" w:fill="B6DDE8"/>
           </w:tcPr>
           <w:p>
@@ -2939,7 +2939,7 @@
         </w:tc>
         <w:tc>
           <w:tcPr>
-            <w:tcW w:type="dxa" w:w="595"/>
+            <w:tcW w:type="dxa" w:w="283"/>
             <w:shd w:val="clear" w:color="auto" w:fill="B6DDE8"/>
           </w:tcPr>
           <w:p>
@@ -3023,7 +3023,7 @@
         </w:tc>
         <w:tc>
           <w:tcPr>
-            <w:tcW w:type="dxa" w:w="1162"/>
+            <w:tcW w:type="dxa" w:w="1219"/>
             <w:shd w:val="clear" w:color="auto" w:fill="B6DDE8"/>
           </w:tcPr>
           <w:p>
@@ -3151,7 +3151,7 @@
       <w:tr>
         <w:tc>
           <w:tcPr>
-            <w:tcW w:type="dxa" w:w="595"/>
+            <w:tcW w:type="dxa" w:w="283"/>
             <w:shd w:val="clear" w:color="auto" w:fill="B6DDE8"/>
           </w:tcPr>
           <w:p>
@@ -3172,7 +3172,7 @@
         </w:tc>
         <w:tc>
           <w:tcPr>
-            <w:tcW w:type="dxa" w:w="595"/>
+            <w:tcW w:type="dxa" w:w="283"/>
             <w:shd w:val="clear" w:color="auto" w:fill="B6DDE8"/>
           </w:tcPr>
           <w:p>
@@ -3258,7 +3258,7 @@
         </w:tc>
         <w:tc>
           <w:tcPr>
-            <w:tcW w:type="dxa" w:w="1162"/>
+            <w:tcW w:type="dxa" w:w="1219"/>
             <w:shd w:val="clear" w:color="auto" w:fill="B6DDE8"/>
           </w:tcPr>
           <w:p>
@@ -3388,7 +3388,7 @@
       <w:tr>
         <w:tc>
           <w:tcPr>
-            <w:tcW w:type="dxa" w:w="595"/>
+            <w:tcW w:type="dxa" w:w="283"/>
             <w:shd w:val="clear" w:color="auto" w:fill="B6DDE8"/>
           </w:tcPr>
           <w:p>
@@ -3409,7 +3409,7 @@
         </w:tc>
         <w:tc>
           <w:tcPr>
-            <w:tcW w:type="dxa" w:w="595"/>
+            <w:tcW w:type="dxa" w:w="283"/>
             <w:shd w:val="clear" w:color="auto" w:fill="B6DDE8"/>
           </w:tcPr>
           <w:p>
@@ -3495,7 +3495,7 @@
         </w:tc>
         <w:tc>
           <w:tcPr>
-            <w:tcW w:type="dxa" w:w="1162"/>
+            <w:tcW w:type="dxa" w:w="1219"/>
             <w:shd w:val="clear" w:color="auto" w:fill="B6DDE8"/>
           </w:tcPr>
           <w:p>
@@ -3625,7 +3625,7 @@
       <w:tr>
         <w:tc>
           <w:tcPr>
-            <w:tcW w:type="dxa" w:w="595"/>
+            <w:tcW w:type="dxa" w:w="283"/>
             <w:shd w:val="clear" w:color="auto" w:fill="B6DDE8"/>
           </w:tcPr>
           <w:p>
@@ -3646,7 +3646,7 @@
         </w:tc>
         <w:tc>
           <w:tcPr>
-            <w:tcW w:type="dxa" w:w="595"/>
+            <w:tcW w:type="dxa" w:w="283"/>
             <w:shd w:val="clear" w:color="auto" w:fill="B6DDE8"/>
           </w:tcPr>
           <w:p>
@@ -3730,7 +3730,7 @@
         </w:tc>
         <w:tc>
           <w:tcPr>
-            <w:tcW w:type="dxa" w:w="1162"/>
+            <w:tcW w:type="dxa" w:w="1219"/>
             <w:shd w:val="clear" w:color="auto" w:fill="B6DDE8"/>
           </w:tcPr>
           <w:p>
@@ -3858,7 +3858,7 @@
       <w:tr>
         <w:tc>
           <w:tcPr>
-            <w:tcW w:type="dxa" w:w="595"/>
+            <w:tcW w:type="dxa" w:w="283"/>
             <w:shd w:val="clear" w:color="auto" w:fill="B6DDE8"/>
           </w:tcPr>
           <w:p>
@@ -3879,7 +3879,7 @@
         </w:tc>
         <w:tc>
           <w:tcPr>
-            <w:tcW w:type="dxa" w:w="595"/>
+            <w:tcW w:type="dxa" w:w="283"/>
             <w:shd w:val="clear" w:color="auto" w:fill="B6DDE8"/>
           </w:tcPr>
           <w:p>
@@ -3964,7 +3964,7 @@
         </w:tc>
         <w:tc>
           <w:tcPr>
-            <w:tcW w:type="dxa" w:w="1162"/>
+            <w:tcW w:type="dxa" w:w="1219"/>
             <w:shd w:val="clear" w:color="auto" w:fill="B6DDE8"/>
           </w:tcPr>
           <w:p>
@@ -4092,7 +4092,7 @@
       <w:tr>
         <w:tc>
           <w:tcPr>
-            <w:tcW w:type="dxa" w:w="595"/>
+            <w:tcW w:type="dxa" w:w="283"/>
             <w:shd w:val="clear" w:color="auto" w:fill="B6DDE8"/>
           </w:tcPr>
           <w:p>
@@ -4113,7 +4113,7 @@
         </w:tc>
         <w:tc>
           <w:tcPr>
-            <w:tcW w:type="dxa" w:w="595"/>
+            <w:tcW w:type="dxa" w:w="283"/>
             <w:shd w:val="clear" w:color="auto" w:fill="B6DDE8"/>
           </w:tcPr>
           <w:p>
@@ -4199,7 +4199,7 @@
         </w:tc>
         <w:tc>
           <w:tcPr>
-            <w:tcW w:type="dxa" w:w="1162"/>
+            <w:tcW w:type="dxa" w:w="1219"/>
             <w:shd w:val="clear" w:color="auto" w:fill="B6DDE8"/>
           </w:tcPr>
           <w:p>
@@ -4329,7 +4329,7 @@
       <w:tr>
         <w:tc>
           <w:tcPr>
-            <w:tcW w:type="dxa" w:w="595"/>
+            <w:tcW w:type="dxa" w:w="283"/>
             <w:shd w:val="clear" w:color="auto" w:fill="B6DDE8"/>
           </w:tcPr>
           <w:p>
@@ -4350,7 +4350,7 @@
         </w:tc>
         <w:tc>
           <w:tcPr>
-            <w:tcW w:type="dxa" w:w="595"/>
+            <w:tcW w:type="dxa" w:w="283"/>
             <w:shd w:val="clear" w:color="auto" w:fill="B6DDE8"/>
           </w:tcPr>
           <w:p>
@@ -4434,7 +4434,7 @@
         </w:tc>
         <w:tc>
           <w:tcPr>
-            <w:tcW w:type="dxa" w:w="1162"/>
+            <w:tcW w:type="dxa" w:w="1219"/>
             <w:shd w:val="clear" w:color="auto" w:fill="B6DDE8"/>
           </w:tcPr>
           <w:p>
@@ -4562,7 +4562,7 @@
       <w:tr>
         <w:tc>
           <w:tcPr>
-            <w:tcW w:type="dxa" w:w="595"/>
+            <w:tcW w:type="dxa" w:w="283"/>
             <w:shd w:val="clear" w:color="auto" w:fill="B6DDE8"/>
           </w:tcPr>
           <w:p>
@@ -4583,7 +4583,7 @@
         </w:tc>
         <w:tc>
           <w:tcPr>
-            <w:tcW w:type="dxa" w:w="595"/>
+            <w:tcW w:type="dxa" w:w="283"/>
             <w:shd w:val="clear" w:color="auto" w:fill="B6DDE8"/>
           </w:tcPr>
           <w:p>
@@ -4667,7 +4667,7 @@
         </w:tc>
         <w:tc>
           <w:tcPr>
-            <w:tcW w:type="dxa" w:w="1162"/>
+            <w:tcW w:type="dxa" w:w="1219"/>
             <w:shd w:val="clear" w:color="auto" w:fill="B6DDE8"/>
           </w:tcPr>
           <w:p>
@@ -4795,7 +4795,7 @@
       <w:tr>
         <w:tc>
           <w:tcPr>
-            <w:tcW w:type="dxa" w:w="595"/>
+            <w:tcW w:type="dxa" w:w="283"/>
             <w:shd w:val="clear" w:color="auto" w:fill="B6DDE8"/>
           </w:tcPr>
           <w:p>
@@ -4816,7 +4816,7 @@
         </w:tc>
         <w:tc>
           <w:tcPr>
-            <w:tcW w:type="dxa" w:w="595"/>
+            <w:tcW w:type="dxa" w:w="283"/>
             <w:shd w:val="clear" w:color="auto" w:fill="B6DDE8"/>
           </w:tcPr>
           <w:p>
@@ -4902,7 +4902,7 @@
         </w:tc>
         <w:tc>
           <w:tcPr>
-            <w:tcW w:type="dxa" w:w="1162"/>
+            <w:tcW w:type="dxa" w:w="1219"/>
             <w:shd w:val="clear" w:color="auto" w:fill="B6DDE8"/>
           </w:tcPr>
           <w:p>
@@ -5032,7 +5032,7 @@
       <w:tr>
         <w:tc>
           <w:tcPr>
-            <w:tcW w:type="dxa" w:w="595"/>
+            <w:tcW w:type="dxa" w:w="283"/>
             <w:shd w:val="clear" w:color="auto" w:fill="B6DDE8"/>
           </w:tcPr>
           <w:p>
@@ -5053,7 +5053,7 @@
         </w:tc>
         <w:tc>
           <w:tcPr>
-            <w:tcW w:type="dxa" w:w="595"/>
+            <w:tcW w:type="dxa" w:w="283"/>
             <w:shd w:val="clear" w:color="auto" w:fill="B6DDE8"/>
           </w:tcPr>
           <w:p>
@@ -5139,7 +5139,7 @@
         </w:tc>
         <w:tc>
           <w:tcPr>
-            <w:tcW w:type="dxa" w:w="1162"/>
+            <w:tcW w:type="dxa" w:w="1219"/>
             <w:shd w:val="clear" w:color="auto" w:fill="B6DDE8"/>
           </w:tcPr>
           <w:p>
@@ -5269,7 +5269,7 @@
       <w:tr>
         <w:tc>
           <w:tcPr>
-            <w:tcW w:type="dxa" w:w="595"/>
+            <w:tcW w:type="dxa" w:w="283"/>
             <w:shd w:val="clear" w:color="auto" w:fill="B6DDE8"/>
           </w:tcPr>
           <w:p>
@@ -5290,7 +5290,7 @@
         </w:tc>
         <w:tc>
           <w:tcPr>
-            <w:tcW w:type="dxa" w:w="595"/>
+            <w:tcW w:type="dxa" w:w="283"/>
             <w:shd w:val="clear" w:color="auto" w:fill="B6DDE8"/>
           </w:tcPr>
           <w:p>
@@ -5374,7 +5374,7 @@
         </w:tc>
         <w:tc>
           <w:tcPr>
-            <w:tcW w:type="dxa" w:w="1162"/>
+            <w:tcW w:type="dxa" w:w="1219"/>
             <w:shd w:val="clear" w:color="auto" w:fill="B6DDE8"/>
           </w:tcPr>
           <w:p>
@@ -5502,7 +5502,7 @@
       <w:tr>
         <w:tc>
           <w:tcPr>
-            <w:tcW w:type="dxa" w:w="595"/>
+            <w:tcW w:type="dxa" w:w="283"/>
             <w:shd w:val="clear" w:color="auto" w:fill="B6DDE8"/>
           </w:tcPr>
           <w:p>
@@ -5523,7 +5523,7 @@
         </w:tc>
         <w:tc>
           <w:tcPr>
-            <w:tcW w:type="dxa" w:w="595"/>
+            <w:tcW w:type="dxa" w:w="283"/>
             <w:shd w:val="clear" w:color="auto" w:fill="B6DDE8"/>
           </w:tcPr>
           <w:p>
@@ -5608,7 +5608,7 @@
         </w:tc>
         <w:tc>
           <w:tcPr>
-            <w:tcW w:type="dxa" w:w="1162"/>
+            <w:tcW w:type="dxa" w:w="1219"/>
             <w:shd w:val="clear" w:color="auto" w:fill="B6DDE8"/>
           </w:tcPr>
           <w:p>
@@ -5736,7 +5736,7 @@
       <w:tr>
         <w:tc>
           <w:tcPr>
-            <w:tcW w:type="dxa" w:w="595"/>
+            <w:tcW w:type="dxa" w:w="283"/>
             <w:shd w:val="clear" w:color="auto" w:fill="B6DDE8"/>
           </w:tcPr>
           <w:p>
@@ -5757,7 +5757,7 @@
         </w:tc>
         <w:tc>
           <w:tcPr>
-            <w:tcW w:type="dxa" w:w="595"/>
+            <w:tcW w:type="dxa" w:w="283"/>
             <w:shd w:val="clear" w:color="auto" w:fill="B6DDE8"/>
           </w:tcPr>
           <w:p>
@@ -5843,7 +5843,7 @@
         </w:tc>
         <w:tc>
           <w:tcPr>
-            <w:tcW w:type="dxa" w:w="1162"/>
+            <w:tcW w:type="dxa" w:w="1219"/>
             <w:shd w:val="clear" w:color="auto" w:fill="B6DDE8"/>
           </w:tcPr>
           <w:p>
@@ -5973,7 +5973,7 @@
       <w:tr>
         <w:tc>
           <w:tcPr>
-            <w:tcW w:type="dxa" w:w="595"/>
+            <w:tcW w:type="dxa" w:w="283"/>
             <w:shd w:val="clear" w:color="auto" w:fill="B6DDE8"/>
           </w:tcPr>
           <w:p>
@@ -5994,7 +5994,7 @@
         </w:tc>
         <w:tc>
           <w:tcPr>
-            <w:tcW w:type="dxa" w:w="595"/>
+            <w:tcW w:type="dxa" w:w="283"/>
             <w:shd w:val="clear" w:color="auto" w:fill="B6DDE8"/>
           </w:tcPr>
           <w:p>
@@ -6078,7 +6078,7 @@
         </w:tc>
         <w:tc>
           <w:tcPr>
-            <w:tcW w:type="dxa" w:w="1162"/>
+            <w:tcW w:type="dxa" w:w="1219"/>
             <w:shd w:val="clear" w:color="auto" w:fill="B6DDE8"/>
           </w:tcPr>
           <w:p>
@@ -6206,7 +6206,7 @@
       <w:tr>
         <w:tc>
           <w:tcPr>
-            <w:tcW w:type="dxa" w:w="595"/>
+            <w:tcW w:type="dxa" w:w="283"/>
             <w:shd w:val="clear" w:color="auto" w:fill="B6DDE8"/>
           </w:tcPr>
           <w:p>
@@ -6227,7 +6227,7 @@
         </w:tc>
         <w:tc>
           <w:tcPr>
-            <w:tcW w:type="dxa" w:w="595"/>
+            <w:tcW w:type="dxa" w:w="283"/>
             <w:shd w:val="clear" w:color="auto" w:fill="B6DDE8"/>
           </w:tcPr>
           <w:p>
@@ -6313,7 +6313,7 @@
         </w:tc>
         <w:tc>
           <w:tcPr>
-            <w:tcW w:type="dxa" w:w="1162"/>
+            <w:tcW w:type="dxa" w:w="1219"/>
             <w:shd w:val="clear" w:color="auto" w:fill="B6DDE8"/>
           </w:tcPr>
           <w:p>
@@ -6441,7 +6441,7 @@
       <w:tr>
         <w:tc>
           <w:tcPr>
-            <w:tcW w:type="dxa" w:w="595"/>
+            <w:tcW w:type="dxa" w:w="283"/>
             <w:shd w:val="clear" w:color="auto" w:fill="B6DDE8"/>
           </w:tcPr>
           <w:p>
@@ -6462,7 +6462,7 @@
         </w:tc>
         <w:tc>
           <w:tcPr>
-            <w:tcW w:type="dxa" w:w="595"/>
+            <w:tcW w:type="dxa" w:w="283"/>
             <w:shd w:val="clear" w:color="auto" w:fill="B6DDE8"/>
           </w:tcPr>
           <w:p>
@@ -6550,7 +6550,7 @@
         </w:tc>
         <w:tc>
           <w:tcPr>
-            <w:tcW w:type="dxa" w:w="1162"/>
+            <w:tcW w:type="dxa" w:w="1219"/>
             <w:shd w:val="clear" w:color="auto" w:fill="B6DDE8"/>
           </w:tcPr>
           <w:p>
@@ -6680,7 +6680,7 @@
       <w:tr>
         <w:tc>
           <w:tcPr>
-            <w:tcW w:type="dxa" w:w="595"/>
+            <w:tcW w:type="dxa" w:w="283"/>
             <w:shd w:val="clear" w:color="auto" w:fill="B6DDE8"/>
           </w:tcPr>
           <w:p>
@@ -6701,7 +6701,7 @@
         </w:tc>
         <w:tc>
           <w:tcPr>
-            <w:tcW w:type="dxa" w:w="595"/>
+            <w:tcW w:type="dxa" w:w="283"/>
             <w:shd w:val="clear" w:color="auto" w:fill="B6DDE8"/>
           </w:tcPr>
           <w:p>
@@ -6789,7 +6789,7 @@
         </w:tc>
         <w:tc>
           <w:tcPr>
-            <w:tcW w:type="dxa" w:w="1162"/>
+            <w:tcW w:type="dxa" w:w="1219"/>
             <w:shd w:val="clear" w:color="auto" w:fill="B6DDE8"/>
           </w:tcPr>
           <w:p>
@@ -6919,7 +6919,7 @@
       <w:tr>
         <w:tc>
           <w:tcPr>
-            <w:tcW w:type="dxa" w:w="595"/>
+            <w:tcW w:type="dxa" w:w="283"/>
             <w:shd w:val="clear" w:color="auto" w:fill="B6DDE8"/>
           </w:tcPr>
           <w:p>
@@ -6940,7 +6940,7 @@
         </w:tc>
         <w:tc>
           <w:tcPr>
-            <w:tcW w:type="dxa" w:w="595"/>
+            <w:tcW w:type="dxa" w:w="283"/>
             <w:shd w:val="clear" w:color="auto" w:fill="B6DDE8"/>
           </w:tcPr>
           <w:p>
@@ -7024,7 +7024,7 @@
         </w:tc>
         <w:tc>
           <w:tcPr>
-            <w:tcW w:type="dxa" w:w="1162"/>
+            <w:tcW w:type="dxa" w:w="1219"/>
             <w:shd w:val="clear" w:color="auto" w:fill="B6DDE8"/>
           </w:tcPr>
           <w:p>
@@ -7152,7 +7152,7 @@
       <w:tr>
         <w:tc>
           <w:tcPr>
-            <w:tcW w:type="dxa" w:w="595"/>
+            <w:tcW w:type="dxa" w:w="283"/>
             <w:shd w:val="clear" w:color="auto" w:fill="B6DDE8"/>
           </w:tcPr>
           <w:p>
@@ -7173,7 +7173,7 @@
         </w:tc>
         <w:tc>
           <w:tcPr>
-            <w:tcW w:type="dxa" w:w="595"/>
+            <w:tcW w:type="dxa" w:w="283"/>
             <w:shd w:val="clear" w:color="auto" w:fill="B6DDE8"/>
           </w:tcPr>
           <w:p>
@@ -7258,7 +7258,7 @@
         </w:tc>
         <w:tc>
           <w:tcPr>
-            <w:tcW w:type="dxa" w:w="1162"/>
+            <w:tcW w:type="dxa" w:w="1219"/>
             <w:shd w:val="clear" w:color="auto" w:fill="B6DDE8"/>
           </w:tcPr>
           <w:p>
@@ -7386,7 +7386,7 @@
       <w:tr>
         <w:tc>
           <w:tcPr>
-            <w:tcW w:type="dxa" w:w="595"/>
+            <w:tcW w:type="dxa" w:w="283"/>
             <w:shd w:val="clear" w:color="auto" w:fill="B6DDE8"/>
           </w:tcPr>
           <w:p>
@@ -7407,7 +7407,7 @@
         </w:tc>
         <w:tc>
           <w:tcPr>
-            <w:tcW w:type="dxa" w:w="595"/>
+            <w:tcW w:type="dxa" w:w="283"/>
             <w:shd w:val="clear" w:color="auto" w:fill="B6DDE8"/>
           </w:tcPr>
           <w:p>
@@ -7493,7 +7493,7 @@
         </w:tc>
         <w:tc>
           <w:tcPr>
-            <w:tcW w:type="dxa" w:w="1162"/>
+            <w:tcW w:type="dxa" w:w="1219"/>
             <w:shd w:val="clear" w:color="auto" w:fill="B6DDE8"/>
           </w:tcPr>
           <w:p>
@@ -7622,7 +7622,7 @@
       </w:tr>
     </w:tbl>
     <w:sectPr>
-      <w:pgSz w:w="11906" w:h="28346"/>
+      <w:pgSz w:w="11906" w:h="16838"/>
       <w:pgMar w:top="850" w:right="850" w:bottom="283" w:left="850" w:header="720" w:footer="720" w:gutter="0"/>
       <w:cols w:space="720"/>
       <w:docGrid w:linePitch="360"/>

</xml_diff>